<commit_message>
Fix 5 typos found in the Help/manual audit
Viewer.docx: expermental -> experimental
WordPress.docx: importatnt -> important
Regions.docx: Treoubleshooting -> Troubleshooting
JOpensim.docx: Dreamrgid -> Dreamgrid
Region.docx and Publicity Overrides.docx: martked -> marked (same typo,
copy-pasted into both - the sentence itself is duplicated boilerplate
across the two manuals, worth a cross-reference instead of two copies
at some point, but out of scope for this pass)

Co-Authored-By: Claude Sonnet 5 <noreply@anthropic.com>
</commit_message>
<xml_diff>
--- a/JOpensim.docx
+++ b/JOpensim.docx
@@ -1,55 +1,5 @@
 
-<file path=docProps\app.xml><?xml version="1.0" encoding="utf-8"?>
-<Properties xmlns="http://schemas.openxmlformats.org/officeDocument/2006/extended-properties" xmlns:vt="http://schemas.openxmlformats.org/officeDocument/2006/docPropsVTypes">
-  <Template>Normal.dotm</Template>
-  <TotalTime>423</TotalTime>
-  <Pages>1</Pages>
-  <Words>509</Words>
-  <Characters>2902</Characters>
-  <Application>Microsoft Office Word</Application>
-  <DocSecurity>0</DocSecurity>
-  <Lines>24</Lines>
-  <Paragraphs>6</Paragraphs>
-  <ScaleCrop>false</ScaleCrop>
-  <HeadingPairs>
-    <vt:vector size="2" baseType="variant">
-      <vt:variant>
-        <vt:lpstr>Title</vt:lpstr>
-      </vt:variant>
-      <vt:variant>
-        <vt:i4>1</vt:i4>
-      </vt:variant>
-    </vt:vector>
-  </HeadingPairs>
-  <TitlesOfParts>
-    <vt:vector size="1" baseType="lpstr">
-      <vt:lpstr/>
-    </vt:vector>
-  </TitlesOfParts>
-  <Company/>
-  <LinksUpToDate>false</LinksUpToDate>
-  <CharactersWithSpaces>3405</CharactersWithSpaces>
-  <SharedDoc>false</SharedDoc>
-  <HyperlinksChanged>false</HyperlinksChanged>
-  <AppVersion>16.0000</AppVersion>
-</Properties>
-</file>
-
-<file path=docProps\core.xml><?xml version="1.0" encoding="utf-8"?>
-<cp:coreProperties xmlns:cp="http://schemas.openxmlformats.org/package/2006/metadata/core-properties" xmlns:dc="http://purl.org/dc/elements/1.1/" xmlns:dcterms="http://purl.org/dc/terms/" xmlns:dcmitype="http://purl.org/dc/dcmitype/" xmlns:xsi="http://www.w3.org/2001/XMLSchema-instance">
-  <dc:title/>
-  <dc:subject/>
-  <dc:creator>Fred Beckhusen</dc:creator>
-  <cp:keywords/>
-  <dc:description/>
-  <cp:lastModifiedBy>Fred Beckhusen</cp:lastModifiedBy>
-  <cp:revision>10</cp:revision>
-  <dcterms:created xsi:type="dcterms:W3CDTF">2021-04-30T04:07:00Z</dcterms:created>
-  <dcterms:modified xsi:type="dcterms:W3CDTF">2024-12-08T22:42:00Z</dcterms:modified>
-</cp:coreProperties>
-</file>
-
-<file path=word\document.xml><?xml version="1.0" encoding="utf-8"?>
+<file path=word/document.xml><?xml version="1.0" encoding="utf-8"?>
 <w:document xmlns:wpc="http://schemas.microsoft.com/office/word/2010/wordprocessingCanvas" xmlns:cx="http://schemas.microsoft.com/office/drawing/2014/chartex" xmlns:cx1="http://schemas.microsoft.com/office/drawing/2015/9/8/chartex" xmlns:cx2="http://schemas.microsoft.com/office/drawing/2015/10/21/chartex" xmlns:cx3="http://schemas.microsoft.com/office/drawing/2016/5/9/chartex" xmlns:cx4="http://schemas.microsoft.com/office/drawing/2016/5/10/chartex" xmlns:cx5="http://schemas.microsoft.com/office/drawing/2016/5/11/chartex" xmlns:cx6="http://schemas.microsoft.com/office/drawing/2016/5/12/chartex" xmlns:cx7="http://schemas.microsoft.com/office/drawing/2016/5/13/chartex" xmlns:cx8="http://schemas.microsoft.com/office/drawing/2016/5/14/chartex" xmlns:mc="http://schemas.openxmlformats.org/markup-compatibility/2006" xmlns:aink="http://schemas.microsoft.com/office/drawing/2016/ink" xmlns:am3d="http://schemas.microsoft.com/office/drawing/2017/model3d" xmlns:o="urn:schemas-microsoft-com:office:office" xmlns:oel="http://schemas.microsoft.com/office/2019/extlst" xmlns:r="http://schemas.openxmlformats.org/officeDocument/2006/relationships" xmlns:m="http://schemas.openxmlformats.org/officeDocument/2006/math" xmlns:v="urn:schemas-microsoft-com:vml" xmlns:wp14="http://schemas.microsoft.com/office/word/2010/wordprocessingDrawing" xmlns:wp="http://schemas.openxmlformats.org/drawingml/2006/wordprocessingDrawing" xmlns:w10="urn:schemas-microsoft-com:office:word" xmlns:w="http://schemas.openxmlformats.org/wordprocessingml/2006/main" xmlns:w14="http://schemas.microsoft.com/office/word/2010/wordml" xmlns:w15="http://schemas.microsoft.com/office/word/2012/wordml" xmlns:w16cex="http://schemas.microsoft.com/office/word/2018/wordml/cex" xmlns:w16cid="http://schemas.microsoft.com/office/word/2016/wordml/cid" xmlns:w16="http://schemas.microsoft.com/office/word/2018/wordml" xmlns:w16du="http://schemas.microsoft.com/office/word/2023/wordml/word16du" xmlns:w16sdtdh="http://schemas.microsoft.com/office/word/2020/wordml/sdtdatahash" xmlns:w16se="http://schemas.microsoft.com/office/word/2015/wordml/symex" xmlns:wpg="http://schemas.microsoft.com/office/word/2010/wordprocessingGroup" xmlns:wpi="http://schemas.microsoft.com/office/word/2010/wordprocessingInk" xmlns:wne="http://schemas.microsoft.com/office/word/2006/wordml" xmlns:wps="http://schemas.microsoft.com/office/word/2010/wordprocessingShape" mc:Ignorable="w14 w15 w16se w16cid w16 w16cex w16sdtdh w16du wp14">
   <w:body>
     <w:p>
@@ -1660,7 +1610,7 @@
     </w:p>
     <w:p>
       <w:r>
-        <w:t xml:space="preserve">To restore a backup, Click [Restore] in the Dreamrgid jOpensim menu to extract kickstart-core-7.0.2.zip and load the URL as shown in section  “Restore the Data”, above.</w:t>
+        <w:t xml:space="preserve">To restore a backup, Click [Restore] in the Dreamgrid jOpensim menu to extract kickstart-core-7.0.2.zip and load the URL as shown in section  “Restore the Data”, above.</w:t>
       </w:r>
     </w:p>
     <w:p/>
@@ -1825,61 +1775,7 @@
 </w:document>
 </file>
 
-<file path=word\fontTable.xml><?xml version="1.0" encoding="utf-8"?>
-<w:fonts xmlns:mc="http://schemas.openxmlformats.org/markup-compatibility/2006" xmlns:r="http://schemas.openxmlformats.org/officeDocument/2006/relationships" xmlns:w="http://schemas.openxmlformats.org/wordprocessingml/2006/main" xmlns:w14="http://schemas.microsoft.com/office/word/2010/wordml" xmlns:w15="http://schemas.microsoft.com/office/word/2012/wordml" xmlns:w16cex="http://schemas.microsoft.com/office/word/2018/wordml/cex" xmlns:w16cid="http://schemas.microsoft.com/office/word/2016/wordml/cid" xmlns:w16="http://schemas.microsoft.com/office/word/2018/wordml" xmlns:w16du="http://schemas.microsoft.com/office/word/2023/wordml/word16du" xmlns:w16sdtdh="http://schemas.microsoft.com/office/word/2020/wordml/sdtdatahash" xmlns:w16se="http://schemas.microsoft.com/office/word/2015/wordml/symex" mc:Ignorable="w14 w15 w16se w16cid w16 w16cex w16sdtdh w16du">
-  <w:font w:name="Symbol">
-    <w:panose1 w:val="05050102010706020507"/>
-    <w:charset w:val="02"/>
-    <w:family w:val="roman"/>
-    <w:pitch w:val="variable"/>
-    <w:sig w:usb0="00000000" w:usb1="10000000" w:usb2="00000000" w:usb3="00000000" w:csb0="80000000" w:csb1="00000000"/>
-  </w:font>
-  <w:font w:name="Times New Roman">
-    <w:panose1 w:val="02020603050405020304"/>
-    <w:charset w:val="00"/>
-    <w:family w:val="roman"/>
-    <w:pitch w:val="variable"/>
-    <w:sig w:usb0="E0002EFF" w:usb1="C000785B" w:usb2="00000009" w:usb3="00000000" w:csb0="000001FF" w:csb1="00000000"/>
-  </w:font>
-  <w:font w:name="Courier New">
-    <w:panose1 w:val="02070309020205020404"/>
-    <w:charset w:val="00"/>
-    <w:family w:val="modern"/>
-    <w:pitch w:val="fixed"/>
-    <w:sig w:usb0="E0002EFF" w:usb1="C0007843" w:usb2="00000009" w:usb3="00000000" w:csb0="000001FF" w:csb1="00000000"/>
-  </w:font>
-  <w:font w:name="Wingdings">
-    <w:panose1 w:val="05000000000000000000"/>
-    <w:charset w:val="02"/>
-    <w:family w:val="auto"/>
-    <w:pitch w:val="variable"/>
-    <w:sig w:usb0="00000000" w:usb1="10000000" w:usb2="00000000" w:usb3="00000000" w:csb0="80000000" w:csb1="00000000"/>
-  </w:font>
-  <w:font w:name="Calibri">
-    <w:panose1 w:val="020F0502020204030204"/>
-    <w:charset w:val="00"/>
-    <w:family w:val="swiss"/>
-    <w:pitch w:val="variable"/>
-    <w:sig w:usb0="E4002EFF" w:usb1="C200247B" w:usb2="00000009" w:usb3="00000000" w:csb0="000001FF" w:csb1="00000000"/>
-  </w:font>
-  <w:font w:name="Verdana">
-    <w:panose1 w:val="020B0604030504040204"/>
-    <w:charset w:val="00"/>
-    <w:family w:val="swiss"/>
-    <w:pitch w:val="variable"/>
-    <w:sig w:usb0="A00006FF" w:usb1="4000205B" w:usb2="00000010" w:usb3="00000000" w:csb0="0000019F" w:csb1="00000000"/>
-  </w:font>
-  <w:font w:name="Calibri Light">
-    <w:panose1 w:val="020F0302020204030204"/>
-    <w:charset w:val="00"/>
-    <w:family w:val="swiss"/>
-    <w:pitch w:val="variable"/>
-    <w:sig w:usb0="E4002EFF" w:usb1="C200247B" w:usb2="00000009" w:usb3="00000000" w:csb0="000001FF" w:csb1="00000000"/>
-  </w:font>
-</w:fonts>
-</file>
-
-<file path=word\numbering.xml><?xml version="1.0" encoding="utf-8"?>
+<file path=word/numbering.xml><?xml version="1.0" encoding="utf-8"?>
 <w:numbering xmlns:wpc="http://schemas.microsoft.com/office/word/2010/wordprocessingCanvas" xmlns:cx="http://schemas.microsoft.com/office/drawing/2014/chartex" xmlns:cx1="http://schemas.microsoft.com/office/drawing/2015/9/8/chartex" xmlns:cx2="http://schemas.microsoft.com/office/drawing/2015/10/21/chartex" xmlns:cx3="http://schemas.microsoft.com/office/drawing/2016/5/9/chartex" xmlns:cx4="http://schemas.microsoft.com/office/drawing/2016/5/10/chartex" xmlns:cx5="http://schemas.microsoft.com/office/drawing/2016/5/11/chartex" xmlns:cx6="http://schemas.microsoft.com/office/drawing/2016/5/12/chartex" xmlns:cx7="http://schemas.microsoft.com/office/drawing/2016/5/13/chartex" xmlns:cx8="http://schemas.microsoft.com/office/drawing/2016/5/14/chartex" xmlns:mc="http://schemas.openxmlformats.org/markup-compatibility/2006" xmlns:aink="http://schemas.microsoft.com/office/drawing/2016/ink" xmlns:am3d="http://schemas.microsoft.com/office/drawing/2017/model3d" xmlns:o="urn:schemas-microsoft-com:office:office" xmlns:oel="http://schemas.microsoft.com/office/2019/extlst" xmlns:r="http://schemas.openxmlformats.org/officeDocument/2006/relationships" xmlns:m="http://schemas.openxmlformats.org/officeDocument/2006/math" xmlns:v="urn:schemas-microsoft-com:vml" xmlns:wp14="http://schemas.microsoft.com/office/word/2010/wordprocessingDrawing" xmlns:wp="http://schemas.openxmlformats.org/drawingml/2006/wordprocessingDrawing" xmlns:w10="urn:schemas-microsoft-com:office:word" xmlns:w="http://schemas.openxmlformats.org/wordprocessingml/2006/main" xmlns:w14="http://schemas.microsoft.com/office/word/2010/wordml" xmlns:w15="http://schemas.microsoft.com/office/word/2012/wordml" xmlns:w16cex="http://schemas.microsoft.com/office/word/2018/wordml/cex" xmlns:w16cid="http://schemas.microsoft.com/office/word/2016/wordml/cid" xmlns:w16="http://schemas.microsoft.com/office/word/2018/wordml" xmlns:w16du="http://schemas.microsoft.com/office/word/2023/wordml/word16du" xmlns:w16sdtdh="http://schemas.microsoft.com/office/word/2020/wordml/sdtdatahash" xmlns:w16se="http://schemas.microsoft.com/office/word/2015/wordml/symex" xmlns:wpg="http://schemas.microsoft.com/office/word/2010/wordprocessingGroup" xmlns:wpi="http://schemas.microsoft.com/office/word/2010/wordprocessingInk" xmlns:wne="http://schemas.microsoft.com/office/word/2006/wordml" xmlns:wps="http://schemas.microsoft.com/office/word/2010/wordprocessingShape" mc:Ignorable="w14 w15 w16se w16cid w16 w16cex w16sdtdh w16du wp14">
   <w:abstractNum w:abstractNumId="0" w15:restartNumberingAfterBreak="0">
     <w:nsid w:val="0AF6367B"/>
@@ -2696,152 +2592,7 @@
 </w:numbering>
 </file>
 
-<file path=word\settings.xml><?xml version="1.0" encoding="utf-8"?>
-<w:settings xmlns:mc="http://schemas.openxmlformats.org/markup-compatibility/2006" xmlns:o="urn:schemas-microsoft-com:office:office" xmlns:r="http://schemas.openxmlformats.org/officeDocument/2006/relationships" xmlns:m="http://schemas.openxmlformats.org/officeDocument/2006/math" xmlns:v="urn:schemas-microsoft-com:vml" xmlns:w10="urn:schemas-microsoft-com:office:word" xmlns:w="http://schemas.openxmlformats.org/wordprocessingml/2006/main" xmlns:w14="http://schemas.microsoft.com/office/word/2010/wordml" xmlns:w15="http://schemas.microsoft.com/office/word/2012/wordml" xmlns:w16cex="http://schemas.microsoft.com/office/word/2018/wordml/cex" xmlns:w16cid="http://schemas.microsoft.com/office/word/2016/wordml/cid" xmlns:w16="http://schemas.microsoft.com/office/word/2018/wordml" xmlns:w16du="http://schemas.microsoft.com/office/word/2023/wordml/word16du" xmlns:w16sdtdh="http://schemas.microsoft.com/office/word/2020/wordml/sdtdatahash" xmlns:w16se="http://schemas.microsoft.com/office/word/2015/wordml/symex" xmlns:sl="http://schemas.openxmlformats.org/schemaLibrary/2006/main" mc:Ignorable="w14 w15 w16se w16cid w16 w16cex w16sdtdh w16du">
-  <w:view w:val="web"/>
-  <w:zoom w:percent="100"/>
-  <w:proofState w:spelling="clean" w:grammar="clean"/>
-  <w:defaultTabStop w:val="720"/>
-  <w:characterSpacingControl w:val="doNotCompress"/>
-  <w:compat>
-    <w:useFELayout/>
-    <w:compatSetting w:name="compatibilityMode" w:uri="http://schemas.microsoft.com/office/word" w:val="12"/>
-    <w:compatSetting w:name="useWord2013TrackBottomHyphenation" w:uri="http://schemas.microsoft.com/office/word" w:val="0"/>
-  </w:compat>
-  <w:rsids>
-    <w:rsidRoot w:val="00EC0D1A"/>
-    <w:rsid w:val="00033A00"/>
-    <w:rsid w:val="0003540E"/>
-    <w:rsid w:val="00062E12"/>
-    <w:rsid w:val="000664BF"/>
-    <w:rsid w:val="000C3972"/>
-    <w:rsid w:val="000D55F4"/>
-    <w:rsid w:val="000E17ED"/>
-    <w:rsid w:val="000E307E"/>
-    <w:rsid w:val="00141CF2"/>
-    <w:rsid w:val="00193001"/>
-    <w:rsid w:val="0022525E"/>
-    <w:rsid w:val="002579F5"/>
-    <w:rsid w:val="00291C0A"/>
-    <w:rsid w:val="002A1CC5"/>
-    <w:rsid w:val="002D18D3"/>
-    <w:rsid w:val="002D4620"/>
-    <w:rsid w:val="002E71C5"/>
-    <w:rsid w:val="00312EFD"/>
-    <w:rsid w:val="00361E9A"/>
-    <w:rsid w:val="00374C6E"/>
-    <w:rsid w:val="003963A3"/>
-    <w:rsid w:val="003A1F51"/>
-    <w:rsid w:val="003D2C96"/>
-    <w:rsid w:val="00406BD4"/>
-    <w:rsid w:val="00432E0D"/>
-    <w:rsid w:val="0044336E"/>
-    <w:rsid w:val="004519DB"/>
-    <w:rsid w:val="004615E3"/>
-    <w:rsid w:val="00462698"/>
-    <w:rsid w:val="00465E0E"/>
-    <w:rsid w:val="00473A68"/>
-    <w:rsid w:val="004A3F72"/>
-    <w:rsid w:val="004B0144"/>
-    <w:rsid w:val="004B5E03"/>
-    <w:rsid w:val="004F5763"/>
-    <w:rsid w:val="005127F5"/>
-    <w:rsid w:val="005976F7"/>
-    <w:rsid w:val="005D40C0"/>
-    <w:rsid w:val="005E67C4"/>
-    <w:rsid w:val="005E746B"/>
-    <w:rsid w:val="00605E97"/>
-    <w:rsid w:val="00626FDA"/>
-    <w:rsid w:val="006C30E0"/>
-    <w:rsid w:val="006F6570"/>
-    <w:rsid w:val="0071236D"/>
-    <w:rsid w:val="007253B7"/>
-    <w:rsid w:val="00772C3C"/>
-    <w:rsid w:val="00775207"/>
-    <w:rsid w:val="0078589D"/>
-    <w:rsid w:val="007C6571"/>
-    <w:rsid w:val="007E440A"/>
-    <w:rsid w:val="00827DC0"/>
-    <w:rsid w:val="00830B9D"/>
-    <w:rsid w:val="008667A8"/>
-    <w:rsid w:val="00887603"/>
-    <w:rsid w:val="008E169C"/>
-    <w:rsid w:val="008E373F"/>
-    <w:rsid w:val="008F20AB"/>
-    <w:rsid w:val="00911C03"/>
-    <w:rsid w:val="0091226E"/>
-    <w:rsid w:val="009166D2"/>
-    <w:rsid w:val="00937A9E"/>
-    <w:rsid w:val="0094746D"/>
-    <w:rsid w:val="009B4B71"/>
-    <w:rsid w:val="009B7DFE"/>
-    <w:rsid w:val="00A35CCD"/>
-    <w:rsid w:val="00A45B54"/>
-    <w:rsid w:val="00A66D93"/>
-    <w:rsid w:val="00A71C98"/>
-    <w:rsid w:val="00A83DD9"/>
-    <w:rsid w:val="00AB30F6"/>
-    <w:rsid w:val="00B36251"/>
-    <w:rsid w:val="00B45931"/>
-    <w:rsid w:val="00B5522B"/>
-    <w:rsid w:val="00BA758E"/>
-    <w:rsid w:val="00C60E32"/>
-    <w:rsid w:val="00CA574B"/>
-    <w:rsid w:val="00CB1F24"/>
-    <w:rsid w:val="00CB3D15"/>
-    <w:rsid w:val="00CF68E6"/>
-    <w:rsid w:val="00DB525F"/>
-    <w:rsid w:val="00DC5FC9"/>
-    <w:rsid w:val="00DD04D0"/>
-    <w:rsid w:val="00DF2491"/>
-    <w:rsid w:val="00E13854"/>
-    <w:rsid w:val="00E25521"/>
-    <w:rsid w:val="00E343C2"/>
-    <w:rsid w:val="00E60CDA"/>
-    <w:rsid w:val="00E64CBA"/>
-    <w:rsid w:val="00E7525B"/>
-    <w:rsid w:val="00E81711"/>
-    <w:rsid w:val="00EA595D"/>
-    <w:rsid w:val="00EB2DEB"/>
-    <w:rsid w:val="00EC0D1A"/>
-    <w:rsid w:val="00EC359C"/>
-    <w:rsid w:val="00F529EF"/>
-    <w:rsid w:val="00FA4CE7"/>
-    <w:rsid w:val="00FC4652"/>
-    <w:rsid w:val="00FE72C0"/>
-  </w:rsids>
-  <m:mathPr>
-    <m:mathFont m:val="Cambria Math"/>
-    <m:brkBin m:val="before"/>
-    <m:brkBinSub m:val="--"/>
-    <m:smallFrac m:val="0"/>
-    <m:dispDef/>
-    <m:lMargin m:val="0"/>
-    <m:rMargin m:val="0"/>
-    <m:defJc m:val="centerGroup"/>
-    <m:wrapIndent m:val="1440"/>
-    <m:intLim m:val="subSup"/>
-    <m:naryLim m:val="undOvr"/>
-  </m:mathPr>
-  <w:themeFontLang w:val="en-US"/>
-  <w:clrSchemeMapping w:bg1="light1" w:t1="dark1" w:bg2="light2" w:t2="dark2" w:accent1="accent1" w:accent2="accent2" w:accent3="accent3" w:accent4="accent4" w:accent5="accent5" w:accent6="accent6" w:hyperlink="hyperlink" w:followedHyperlink="followedHyperlink"/>
-  <w:doNotIncludeSubdocsInStats/>
-  <w:doNotAutoCompressPictures/>
-  <w:shapeDefaults>
-    <o:shapedefaults v:ext="edit" spidmax="1026"/>
-    <o:shapelayout v:ext="edit">
-      <o:idmap v:ext="edit" data="1"/>
-    </o:shapelayout>
-  </w:shapeDefaults>
-  <w:decimalSymbol w:val="."/>
-  <w:listSeparator w:val=","/>
-  <w14:docId w14:val="63EFD6EC"/>
-  <w14:defaultImageDpi w14:val="0"/>
-  <w15:docId w15:val="{524BB74F-4785-4A77-A24F-51E1F386DD49}"/>
-</w:settings>
-</file>
-
-<file path=word\styles.xml><?xml version="1.0" encoding="utf-8"?>
+<file path=word/styles.xml><?xml version="1.0" encoding="utf-8"?>
 <w:styles xmlns:mc="http://schemas.openxmlformats.org/markup-compatibility/2006" xmlns:r="http://schemas.openxmlformats.org/officeDocument/2006/relationships" xmlns:w="http://schemas.openxmlformats.org/wordprocessingml/2006/main" xmlns:w14="http://schemas.microsoft.com/office/word/2010/wordml" xmlns:w15="http://schemas.microsoft.com/office/word/2012/wordml" xmlns:w16cex="http://schemas.microsoft.com/office/word/2018/wordml/cex" xmlns:w16cid="http://schemas.microsoft.com/office/word/2016/wordml/cid" xmlns:w16="http://schemas.microsoft.com/office/word/2018/wordml" xmlns:w16du="http://schemas.microsoft.com/office/word/2023/wordml/word16du" xmlns:w16sdtdh="http://schemas.microsoft.com/office/word/2020/wordml/sdtdatahash" xmlns:w16se="http://schemas.microsoft.com/office/word/2015/wordml/symex" mc:Ignorable="w14 w15 w16se w16cid w16 w16cex w16sdtdh w16du">
   <w:docDefaults>
     <w:rPrDefault>
@@ -3958,7 +3709,7 @@
 </w:styles>
 </file>
 
-<file path=word\theme\theme1.xml><?xml version="1.0" encoding="utf-8"?>
+<file path=word/theme/theme1.xml><?xml version="1.0" encoding="utf-8"?>
 <a:theme xmlns:a="http://schemas.openxmlformats.org/drawingml/2006/main" name="Office Theme">
   <a:themeElements>
     <a:clrScheme name="Office">
@@ -4251,25 +4002,4 @@
     </a:ext>
   </a:extLst>
 </a:theme>
-</file>
-
-<file path=word\webSettings.xml><?xml version="1.0" encoding="utf-8"?>
-<w:webSettings xmlns:mc="http://schemas.openxmlformats.org/markup-compatibility/2006" xmlns:r="http://schemas.openxmlformats.org/officeDocument/2006/relationships" xmlns:w="http://schemas.openxmlformats.org/wordprocessingml/2006/main" xmlns:w14="http://schemas.microsoft.com/office/word/2010/wordml" xmlns:w15="http://schemas.microsoft.com/office/word/2012/wordml" xmlns:w16cex="http://schemas.microsoft.com/office/word/2018/wordml/cex" xmlns:w16cid="http://schemas.microsoft.com/office/word/2016/wordml/cid" xmlns:w16="http://schemas.microsoft.com/office/word/2018/wordml" xmlns:w16du="http://schemas.microsoft.com/office/word/2023/wordml/word16du" xmlns:w16sdtdh="http://schemas.microsoft.com/office/word/2020/wordml/sdtdatahash" xmlns:w16se="http://schemas.microsoft.com/office/word/2015/wordml/symex" mc:Ignorable="w14 w15 w16se w16cid w16 w16cex w16sdtdh w16du">
-  <w:divs>
-    <w:div w:id="1432820273">
-      <w:marLeft w:val="0"/>
-      <w:marRight w:val="0"/>
-      <w:marTop w:val="0"/>
-      <w:marBottom w:val="0"/>
-      <w:divBdr>
-        <w:top w:val="none" w:sz="0" w:space="0" w:color="auto"/>
-        <w:left w:val="none" w:sz="0" w:space="0" w:color="auto"/>
-        <w:bottom w:val="none" w:sz="0" w:space="0" w:color="auto"/>
-        <w:right w:val="none" w:sz="0" w:space="0" w:color="auto"/>
-      </w:divBdr>
-    </w:div>
-  </w:divs>
-  <w:optimizeForBrowser/>
-  <w:allowPNG/>
-</w:webSettings>
 </file>
</xml_diff>

<commit_message>
WordPress, JOpensim, Joomla Update: the screens are now under Install CMS
DreamGrid's Settings screen has one "Install CMS" button that opens a
chooser with a WordPress button and a Joomla button (DreamGrid e3e7f0f3).

- JOpensim, Joomla Update: the four places that said where to click now
  say Setup->Settings->Install CMS->Joomla.
- WordPress: new section on the WordPress screen in DreamGrid, how to
  open it, and what each button does. Says both can be installed.

Co-Authored-By: Claude Fable 5.1 <noreply@anthropic.com>
</commit_message>
<xml_diff>
--- a/JOpensim.docx
+++ b/JOpensim.docx
@@ -155,7 +155,7 @@
     </w:p>
     <w:p>
       <w:r>
-        <w:t xml:space="preserve">Click Setup-&gt;Joomla/JOpensim and click the Install Button.   </w:t>
+        <w:t xml:space="preserve">Click Setup-&gt;Settings-&gt;Install CMS, then click Joomla. On the JOpensim screen, click the Install button.   </w:t>
         <w:br/>
       </w:r>
       <w:r>
@@ -635,7 +635,7 @@
         </w:r>
       </w:hyperlink>
       <w:r>
-        <w:t>, or in Setup-&gt;Settings-&gt;Joomla/jOpensim, click the [Restore] button.</w:t>
+        <w:t>, or in Setup-&gt;Settings-&gt;Install CMS-&gt;Joomla, click the [Restore] button.</w:t>
       </w:r>
     </w:p>
     <w:p>

</xml_diff>